<commit_message>
Add line break for improved readability in policy confirmation email
</commit_message>
<xml_diff>
--- a/row/de/email.docx
+++ b/row/de/email.docx
@@ -767,7 +767,14 @@
               <w:rPr>
                 <w:lang w:val="de-DE"/>
               </w:rPr>
-              <w:t>Wünschen Sie den Versand Ihrer Versicherungsunterlagen per Post, so können Sie uns mit dieser Bitte anrufen oder uns eine entsprechende E-Mail schreiben (Telefonnummer und E-Mail-Adresse siehe oben). </w:t>
+              <w:t xml:space="preserve">Wünschen Sie den Versand Ihrer Versicherungsunterlagen per Post, so können Sie uns </w:t>
+            </w:r>
+            <w:r>
+              <w:rPr>
+                <w:lang w:val="de-DE"/>
+              </w:rPr>
+              <w:lastRenderedPageBreak/>
+              <w:t>mit dieser Bitte anrufen oder uns eine entsprechende E-Mail schreiben (Telefonnummer und E-Mail-Adresse siehe oben). </w:t>
             </w:r>
           </w:p>
           <w:p>

</xml_diff>